<commit_message>
Document Rubin source cross-checks and alternative research limits
</commit_message>
<xml_diff>
--- a/docs/malu/MALU_design_v1.1.docx
+++ b/docs/malu/MALU_design_v1.1.docx
@@ -11652,6 +11652,48 @@
       </w:r>
     </w:p>
     <w:p>
+      <w:pPr>
+        <w:pStyle w:val="Heading2"/>
+      </w:pPr>
+      <w:r>
+        <w:t>13.5 替代来源与交叉核验</w:t>
+      </w:r>
+    </w:p>
+    <w:p>
+      <w:r>
+        <w:rPr>
+          <w:rFonts w:ascii="Noto Sans CJK SC" w:hAnsi="Noto Sans CJK SC" w:eastAsia="Noto Sans CJK SC" w:cs="Noto Sans CJK SC"/>
+          <w:color w:val="213342"/>
+        </w:rPr>
+        <w:t>本轮同时检查 ServeTheHome、Tom’s Hardware、TechPowerUp、TrendForce、SemiAnalysis 等第三方入口，并使用 Bing/GitHub 公开检索。部分第三方直接页面在代理 CONNECT 阶段被403拒绝；部分搜索结果不相关，已排除。未取得全文或完整口径的媒体内容不进入算力比例表，也不伪称独立实测。官方现已恢复，因此本版采用实际读取的一手表格和脚注，不因替代来源尚未闭合而继续空置已有依据的数值。</w:t>
+      </w:r>
+    </w:p>
+    <w:p>
+      <w:r>
+        <w:rPr>
+          <w:rFonts w:ascii="Noto Sans CJK SC" w:hAnsi="Noto Sans CJK SC" w:eastAsia="Noto Sans CJK SC" w:cs="Noto Sans CJK SC"/>
+          <w:color w:val="213342"/>
+        </w:rPr>
+        <w:t xml:space="preserve">详细的访问结果、证据层级和不采用原因见 </w:t>
+      </w:r>
+      <w:hyperlink r:id="rId16">
+        <w:r>
+          <w:rPr>
+            <w:color w:val="087F8C"/>
+            <w:rFonts w:ascii="Noto Sans CJK SC" w:hAnsi="Noto Sans CJK SC" w:eastAsia="Noto Sans CJK SC"/>
+          </w:rPr>
+          <w:t>Rubin 来源交叉核验记录</w:t>
+        </w:r>
+      </w:hyperlink>
+      <w:r>
+        <w:rPr>
+          <w:rFonts w:ascii="Noto Sans CJK SC" w:hAnsi="Noto Sans CJK SC" w:eastAsia="Noto Sans CJK SC" w:cs="Noto Sans CJK SC"/>
+          <w:color w:val="213342"/>
+        </w:rPr>
+        <w:t>。NVIDIA产品页与技术博客来自同一厂商，它们之间的一致性核对不等于两次独立硬件测量。</w:t>
+      </w:r>
+    </w:p>
+    <w:p>
       <w:bookmarkStart w:id="15" w:name="section_15"/>
       <w:pPr>
         <w:pStyle w:val="Heading1"/>
@@ -13653,7 +13695,7 @@
                     <pic:cNvPicPr/>
                   </pic:nvPicPr>
                   <pic:blipFill>
-                    <a:blip r:embed="rId16"/>
+                    <a:blip r:embed="rId17"/>
                     <a:stretch>
                       <a:fillRect/>
                     </a:stretch>
@@ -13742,7 +13784,7 @@
                     <pic:cNvPicPr/>
                   </pic:nvPicPr>
                   <pic:blipFill>
-                    <a:blip r:embed="rId17"/>
+                    <a:blip r:embed="rId18"/>
                     <a:stretch>
                       <a:fillRect/>
                     </a:stretch>
@@ -17014,7 +17056,7 @@
             <w:pPr>
               <w:spacing w:after="40" w:before="0" w:line="269" w:lineRule="auto"/>
             </w:pPr>
-            <w:hyperlink r:id="rId18">
+            <w:hyperlink r:id="rId19">
               <w:r>
                 <w:rPr>
                   <w:color w:val="087F8C"/>
@@ -17106,7 +17148,7 @@
             <w:pPr>
               <w:spacing w:after="40" w:before="0" w:line="269" w:lineRule="auto"/>
             </w:pPr>
-            <w:hyperlink r:id="rId19">
+            <w:hyperlink r:id="rId20">
               <w:r>
                 <w:rPr>
                   <w:color w:val="087F8C"/>

</xml_diff>